<commit_message>
docs: expand guide and remove local paths
</commit_message>
<xml_diff>
--- a/docs/第一阶段初开发启动指导书.docx
+++ b/docs/第一阶段初开发启动指导书.docx
@@ -298,7 +298,7 @@
           <w:rFonts w:ascii="Consolas" w:hAnsi="Consolas" w:eastAsia="Consolas"/>
           <w:sz w:val="18"/>
         </w:rPr>
-        <w:t>F:\工程实践II\保险产品推荐\insurance-product-recommendation</w:t>
+        <w:t>path\to\insurance-product-recommendation</w:t>
       </w:r>
     </w:p>
     <w:p>
@@ -2413,7 +2413,7 @@
           <w:rFonts w:ascii="Consolas" w:hAnsi="Consolas" w:eastAsia="Consolas"/>
           <w:sz w:val="18"/>
         </w:rPr>
-        <w:t>F:\工程实践II\insurance-product-recommendation</w:t>
+        <w:t>path\to\insurance-product-recommendation</w:t>
       </w:r>
     </w:p>
     <w:p>

</xml_diff>